<commit_message>
docs: use canonical contract ID CDQQEMPK... everywhere
Replace the old contract IDs (CA6KYPPX, CBOCCS4, CAWUEAIR, and a typo'd
CA6KYPPX variant with broken links) with the canonical testnet contract
CDQQEMPK3F6ZKURO3CKOUD6GQZ6ZGWOZVENZ4U7BEVFLHDR4MBUN5TJC in READMEs, docs,
the Technical Documentation .docx, example env files, adapter comments,
an env unit-test fixture and the contract helper scripts. DEPLOYMENT.md
now states the canonical contract and how to switch a deployment to it.
</commit_message>
<xml_diff>
--- a/backend/Technical Documentation.docx
+++ b/backend/Technical Documentation.docx
@@ -1964,7 +1964,7 @@
           <w:rFonts w:ascii="Courier New"/>
           <w:spacing w:val="-2"/>
         </w:rPr>
-        <w:t>CBOCCS4EYS5WV273UJRHBM6QN4NGBV5Y4EGKON3UYBBEQ62LVHV3ZMLS</w:t>
+        <w:t>CDQQEMPK3F6ZKURO3CKOUD6GQZ6ZGWOZVENZ4U7BEVFLHDR4MBUN5TJC</w:t>
       </w:r>
     </w:p>
     <w:p>
@@ -11777,7 +11777,7 @@
           <w:rFonts w:ascii="Courier New"/>
           <w:spacing w:val="-2"/>
         </w:rPr>
-        <w:t>CBOCCS4EYS5WV273UJRHBM6QN4NGBV5Y4EGKON3UYBBEQ62LVHV3ZMLS</w:t>
+        <w:t>CDQQEMPK3F6ZKURO3CKOUD6GQZ6ZGWOZVENZ4U7BEVFLHDR4MBUN5TJC</w:t>
       </w:r>
     </w:p>
     <w:p>

</xml_diff>

<commit_message>
docs: fix remaining old contract link text in Technical Documentation.docx
</commit_message>
<xml_diff>
--- a/backend/Technical Documentation.docx
+++ b/backend/Technical Documentation.docx
@@ -300,7 +300,7 @@
             <w:spacing w:val="-4"/>
             <w:u w:val="thick"/>
           </w:rPr>
-          <w:t>https://stellar.expert/explorer/testnet/contract/CBOCCS4EYS5WV273UJRHBM6QN4NGBV5Y4</w:t>
+          <w:t>https://stellar.expert/explorer/testnet/contract/CDQQEMPK3F6ZKURO3CKOUD6GQZ6ZGWOZVENZ4U7BEVFLHDR4MBUN5TJC</w:t>
         </w:r>
       </w:hyperlink>
       <w:r>
@@ -315,7 +315,7 @@
             <w:spacing w:val="-2"/>
             <w:u w:val="thick"/>
           </w:rPr>
-          <w:t>EGKON3UYBBEQ62LVHV3ZMLS?filter=interface</w:t>
+          <w:t/>
         </w:r>
       </w:hyperlink>
     </w:p>

</xml_diff>